<commit_message>
Insert May 2026 Results section into report docx; update CLAUDE.md
- Drafted and inserted 5-figure Results section into 5_May report - Sothearoth Heng.docx
- Updated CLAUDE.md with data analysis capability and output folder rules

Co-Authored-By: Claude Sonnet 4.6 <noreply@anthropic.com>
</commit_message>
<xml_diff>
--- a/plotted graphs/May/5_May report - Sothearoth Heng.docx
+++ b/plotted graphs/May/5_May report - Sothearoth Heng.docx
@@ -3396,6 +3396,320 @@
       </w:pPr>
     </w:p>
     <w:bookmarkEnd w:id="0"/>
+    <w:p>
+      <w:pPr>
+        <w:pStyle w:val="Normal"/>
+      </w:pPr>
+    </w:p>
+    <w:p>
+      <w:pPr>
+        <w:pStyle w:val="Normal"/>
+      </w:pPr>
+      <w:r>
+        <w:rPr>
+          <w:b/>
+          <w:sz w:val="22"/>
+          <w:szCs w:val="22"/>
+        </w:rPr>
+        <w:t xml:space="preserve">CO₂RR performance and reproducibility of AgNPs (&gt;100 nm) in 5 cm² AEM MEA electrolyzer</w:t>
+      </w:r>
+    </w:p>
+    <w:p>
+      <w:pPr>
+        <w:pStyle w:val="Normal"/>
+      </w:pPr>
+      <w:r>
+        <w:rPr>
+          <w:sz w:val="22"/>
+          <w:szCs w:val="22"/>
+        </w:rPr>
+        <w:t xml:space="preserve">To verify the CO₂RR performance and reproducibility of the AgNPs catalyst in the AEM system, CO₂ electrolysis was conducted twice using AgNPs (&gt;100 nm, 0.6 mg·cm⁻²) in a 5 cm² AEM (Sustanion) MEA electrolyzer under 50 mM CH₃COOH humidified CO₂ (20 ml·min⁻¹), 4 ml·min⁻¹ of 0.1 M KHCO₃, and an IrO₂-TiPt anode at 100 mA·cm⁻². As shown in Figure 1a, the 1st run achieved an initial FE(CO) of approximately 75%, which partially recovered to ~80% at ~100 h before declining gradually. However, physical damage to the AEM was identified at approximately 230 h, terminating the run at ~300 h, as evidenced by the post-mortem photographs in Figure 1a. The 2nd run (Figure 1b), conducted following membrane replacement under identical conditions, yielded a lower initial FE(CO) of approximately 20–25%, which scattered between 60–85% at subsequent GC measurements throughout the ~350 h operation, with a stable cell voltage maintained at approximately 3.5 V. It is worth noting that the lower initial FE(CO) in the 2nd run might be resulted from incomplete MEA conditioning or variation in the GDE/AEM interfacial contact upon reassembly, rather than catalyst deactivation — the stable cell voltage throughout the run supports the absence of a progressive flooding or kinetic degradation mechanism. Taken together, these repeat runs confirm that the AgNPs/AEM/IrO₂-TiPt configuration is operable at the 5 cm² scale over extended periods, with AEM mechanical integrity identified as a key limiting factor for long-term durability.</w:t>
+      </w:r>
+    </w:p>
+    <w:p>
+      <w:pPr>
+        <w:pStyle w:val="Normal"/>
+      </w:pPr>
+    </w:p>
+    <w:p>
+      <w:pPr>
+        <w:pStyle w:val="Normal"/>
+      </w:pPr>
+      <w:r>
+        <w:rPr>
+          <w:i/>
+          <w:sz w:val="22"/>
+          <w:szCs w:val="22"/>
+        </w:rPr>
+        <w:t xml:space="preserve">Figure 1. CO₂ electrolysis of AgNPs (&gt;100 nm, 0.6 mg·cm⁻²) in a 5 cm² AEM (Sustanion) MEA electrolyzer under 50 mM CH₃COOH humidified CO₂ (20 ml·min⁻¹), 4 ml·min⁻¹ 0.1 M KHCO₃, and IrO₂-TiPt anode at 100 mA·cm⁻². (a) 1st run. (b) 2nd run.</w:t>
+      </w:r>
+    </w:p>
+    <w:p>
+      <w:pPr>
+        <w:pStyle w:val="Normal"/>
+      </w:pPr>
+    </w:p>
+    <w:p>
+      <w:pPr>
+        <w:pStyle w:val="Normal"/>
+      </w:pPr>
+      <w:r>
+        <w:rPr>
+          <w:b/>
+          <w:sz w:val="22"/>
+          <w:szCs w:val="22"/>
+        </w:rPr>
+        <w:t xml:space="preserve">Effect of AgNPs particle size (50 nm vs &gt;100 nm) on CO₂RR performance in 5 cm² AEM MEA electrolyzer</w:t>
+      </w:r>
+    </w:p>
+    <w:p>
+      <w:pPr>
+        <w:pStyle w:val="Normal"/>
+      </w:pPr>
+      <w:r>
+        <w:rPr>
+          <w:sz w:val="22"/>
+          <w:szCs w:val="22"/>
+        </w:rPr>
+        <w:t xml:space="preserve">To ascertain the effect of AgNPs particle size on CO₂RR performance under enhanced acid humidification, CO₂ electrolysis of AgNPs (50 nm) and AgNPs (&gt;100 nm) at a catalyst loading of 0.6 mg·cm⁻² was comparatively evaluated in a 5 cm² AEM (Sustanion) MEA electrolyzer under 0.5 M CH₃COOH humidified CO₂ (20 ml·min⁻¹), 4 ml·min⁻¹ of 0.1 M KHCO₃, and an IrO₂-TiPt anode at 100 mA·cm⁻². As shown in Figure 2a, both particle sizes achieved high initial FE(CO) of approximately 90% and ~85–90% for 50 nm and &gt;100 nm, respectively, with a stable cell voltage of approximately 3.5 V throughout the ~45 h run. The &gt;100 nm AgNPs demonstrated marginally more sustained FE(CO), maintaining approximately 90% at both the 15 h and 40 h measurement points, while the 50 nm particles exhibited comparable performance. This might be resulted from the larger particle size providing a surface chemistry that is inherently more resistant to K⁺-mediated salt accumulation and wettability loss under the elevated 0.5 M CH₃COOH humidification condition, as larger Ag nanoparticles present a lower surface-area-to-volume ratio that reduces local (bi)carbonate ion concentration at the catalyst surface. Compared to the 50 mM acid condition used in the reproducibility runs (Figure 1), the 0.5 M CH₃COOH humidification markedly suppressed salt formation, enabling both particle sizes to sustain high FE(CO) throughout the run without the AEM failure observed previously.</w:t>
+      </w:r>
+    </w:p>
+    <w:p>
+      <w:pPr>
+        <w:pStyle w:val="Normal"/>
+      </w:pPr>
+    </w:p>
+    <w:p>
+      <w:pPr>
+        <w:pStyle w:val="Normal"/>
+      </w:pPr>
+      <w:r>
+        <w:rPr>
+          <w:i/>
+          <w:sz w:val="22"/>
+          <w:szCs w:val="22"/>
+        </w:rPr>
+        <w:t xml:space="preserve">Figure 2a. FE(CO) and cell voltage of AgNPs (50 nm and &gt;100 nm, 0.6 mg·cm⁻²) in a 5 cm² AEM (Sustanion) MEA electrolyzer under 0.5 M CH₃COOH humidified CO₂ (20 ml·min⁻¹), 4 ml·min⁻¹ 0.1 M KHCO₃, and IrO₂-TiPt anode at 100 mA·cm⁻².</w:t>
+      </w:r>
+    </w:p>
+    <w:p>
+      <w:pPr>
+        <w:pStyle w:val="Normal"/>
+      </w:pPr>
+    </w:p>
+    <w:p>
+      <w:pPr>
+        <w:pStyle w:val="Normal"/>
+      </w:pPr>
+      <w:r>
+        <w:rPr>
+          <w:b/>
+          <w:sz w:val="22"/>
+          <w:szCs w:val="22"/>
+        </w:rPr>
+        <w:t xml:space="preserve">Comparison of AgNPs (100 nm) and 0.5NiSAC catalysts in AEM system at 5 cm² and 100 cm²</w:t>
+      </w:r>
+    </w:p>
+    <w:p>
+      <w:pPr>
+        <w:pStyle w:val="Normal"/>
+      </w:pPr>
+      <w:r>
+        <w:rPr>
+          <w:sz w:val="22"/>
+          <w:szCs w:val="22"/>
+        </w:rPr>
+        <w:t xml:space="preserve">To evaluate the suitability of the 0.5NiSAC catalyst in the AEM-based electrolyzer and compare its performance with AgNPs, CO₂ electrolysis was conducted using AgNPs (100 nm, 0.6 mg·cm⁻²) and 0.5NiSAC (1.8 mg·cm⁻², synthesised at 800 °C for 4 h at a ramp rate of 10 °C·min⁻¹) as cathode catalysts in a 5 cm² AEM (Sustanion) MEA electrolyzer under 0.5 M CH₃COOH humidified CO₂ (200 ml·min⁻¹), 100 ml·min⁻¹ of 0.1 M KHCO₃, and an IrO₂-TiPt anode at 100 mA·cm⁻². As shown in Figure 4 (top), the AgNPs cathode achieved a significantly higher initial FE(CO) of approximately 96–97%, which was sustained above ~83% for the first ~250 h, with a cell voltage that gradually rose from approximately 3.0 V to ~3.5 V over the 360 h operation. In contrast, the 0.5NiSAC cathode delivered a lower initial FE(CO) of approximately 80–82%, accompanied by a steep rise in cell voltage from ~3.5 V to above 4.5 V after ~200 h of continuous operation. The markedly different voltage fingerprints confirm distinct failure mechanisms: the gradual voltage rise in the AgNPs system is consistent with progressive mild kinetic aging of the Ag catalyst and/or minor salt accumulation over extended operation despite the elevated acid concentration, whereas the steep voltage rise in the 0.5NiSAC system is the characteristic kinetic degradation signature — progressive deactivation of Ni single-atom sites under the alkaline AEM microenvironment, where the locally alkaline pH kinetically favours HER over CO₂RR. This is in direct contrast to the BPM system, in which NiSAC demonstrates superior CO selectivity due to the acidic local microenvironment generated at the cathode/CEM interface.</w:t>
+      </w:r>
+    </w:p>
+    <w:p>
+      <w:pPr>
+        <w:pStyle w:val="Normal"/>
+      </w:pPr>
+    </w:p>
+    <w:p>
+      <w:pPr>
+        <w:pStyle w:val="Normal"/>
+      </w:pPr>
+      <w:r>
+        <w:rPr>
+          <w:sz w:val="22"/>
+          <w:szCs w:val="22"/>
+        </w:rPr>
+        <w:t xml:space="preserve">To further assess the NiSAC catalyst at the 100 cm² scale in the AEM system, a preliminary CO₂ electrolysis test was performed using 0.5NiSAC (1.8 mg·cm⁻²) in a 100 cm² AEM (Sustanion) MEA electrolyzer under 50 mM CH₃COOH humidified CO₂ (200 ml·min⁻¹), 100 ml·min⁻¹ of 0.1 M KHCO₃, and an IrO₂-TiPt anode at 100 mA·cm⁻². As shown in Figure 4 (bottom), the cell voltage rose steadily from approximately 3.0 V to ~3.5 V over the 20 h test, consistent with the kinetic degradation fingerprint observed at the 5 cm² scale. It is worth noting that no GC measurements were collected during this preliminary run; therefore, further extended testing with GC analysis is required to quantify FE(CO) and confirm the durability profile of NiSAC in the 100 cm² AEM configuration.</w:t>
+      </w:r>
+    </w:p>
+    <w:p>
+      <w:pPr>
+        <w:pStyle w:val="Normal"/>
+      </w:pPr>
+    </w:p>
+    <w:p>
+      <w:pPr>
+        <w:pStyle w:val="Normal"/>
+      </w:pPr>
+      <w:r>
+        <w:rPr>
+          <w:i/>
+          <w:sz w:val="22"/>
+          <w:szCs w:val="22"/>
+        </w:rPr>
+        <w:t xml:space="preserve">Figure 4. FE(CO) and cell voltage of AgNPs (100 nm, 0.6 mg·cm⁻²) and 0.5NiSAC (1.8 mg·cm⁻², 800 °C–4 h–10 °C·min⁻¹) in 5 cm² AEM (Sustanion) MEA electrolyzer under 0.5 M CH₃COOH humidified CO₂ (200 ml·min⁻¹), 100 ml·min⁻¹ 0.1 M KHCO₃, and IrO₂-TiPt anode at 100 mA·cm⁻² (top). Cell voltage of 0.5NiSAC (1.8 mg·cm⁻²) in 100 cm² AEM MEA electrolyzer under 50 mM CH₃COOH humidified CO₂ (200 ml·min⁻¹), 100 ml·min⁻¹ 0.1 M KHCO₃, and IrO₂-TiPt anode at 100 mA·cm⁻² (bottom).</w:t>
+      </w:r>
+    </w:p>
+    <w:p>
+      <w:pPr>
+        <w:pStyle w:val="Normal"/>
+      </w:pPr>
+    </w:p>
+    <w:p>
+      <w:pPr>
+        <w:pStyle w:val="Normal"/>
+      </w:pPr>
+      <w:r>
+        <w:rPr>
+          <w:b/>
+          <w:sz w:val="22"/>
+          <w:szCs w:val="22"/>
+        </w:rPr>
+        <w:t xml:space="preserve">Effect of cathode flow-field configuration on CO₂RR performance and durability at 100 cm²</w:t>
+      </w:r>
+    </w:p>
+    <w:p>
+      <w:pPr>
+        <w:pStyle w:val="Normal"/>
+      </w:pPr>
+      <w:r>
+        <w:rPr>
+          <w:sz w:val="22"/>
+          <w:szCs w:val="22"/>
+        </w:rPr>
+        <w:t xml:space="preserve">To ascertain the effect of cathode flow-field configuration on CO₂RR performance and long-term durability, CO₂ electrolysis of AgNPs (&gt;100 nm, 0.4–0.5 mg·cm⁻²) was conducted in a 100 cm² AEM (Sustanion) MEA electrolyzer with three cathode flow-field configurations — single-serpentine, quad-serpentine, and parallel — under 50 mM CH₃COOH humidified CO₂ (200 ml·min⁻¹), 100 ml·min⁻¹ of 0.1 M KHCO₃, and an IrO₂-TiPt anode at 100 mA·cm⁻². As shown in Figure 2b, all three configurations achieved comparable initial FE(CO) of approximately 92–93%. The single-serpentine configuration demonstrated the best durability, sustaining FE(CO) above 80% for approximately 40 h before a gradual decline, with a CO₂ flushing event performed at ~47–50 h (highlighted in green) temporarily restoring both FE(CO) and cell voltage, extending the run to ~55 h in total. The quad-serpentine configuration exhibited a similar but faster decline, terminating at approximately 43 h. The parallel flow-field showed the most rapid FE(CO) collapse, with the system reaching failure at approximately 20 h. Notably, the cell voltage for both serpentine configurations decreased progressively as FE(CO) declined, whereas the parallel configuration maintained a stable cell voltage throughout the run despite the significantly faster FE(CO) collapse.</w:t>
+      </w:r>
+    </w:p>
+    <w:p>
+      <w:pPr>
+        <w:pStyle w:val="Normal"/>
+      </w:pPr>
+    </w:p>
+    <w:p>
+      <w:pPr>
+        <w:pStyle w:val="Normal"/>
+      </w:pPr>
+      <w:r>
+        <w:rPr>
+          <w:sz w:val="22"/>
+          <w:szCs w:val="22"/>
+        </w:rPr>
+        <w:t xml:space="preserve">The complementary cathode CO₂ inlet pressure profiles shown in Figure 3 provide direct hydraulic evidence for the mechanistic distinction between these failure modes. The single-serpentine and quad-serpentine configurations both exhibited a progressive rise in inlet pressure from approximately 80 mbar at the start to ~120–130 mbar by 40–50 h, punctuated by intermittent pressure spikes, consistent with the gradual accumulation of K⁺-mediated carbonate/bicarbonate salt crystals at the serpentine CO₂ inlet restricting gas flow. The temporary pressure drop during the flushing event (single-serpentine, ~47–50 h) directly confirms that physical blockage — rather than catalyst deactivation — was the primary cause of performance degradation, as flushing re-opened CO₂ pathways and partially restored FE(CO). In contrast, the parallel flow-field exhibited a brief but pronounced pressure spike to approximately 180–200 mbar within the first hour, followed by a rapid return to ~80–90 mbar that remained stable until run termination. This initial spike is consistent with rapid accumulation of liquid water droplets in the low-velocity parallel channels followed by partial clearing, while the subsequently stable pressure reflects ongoing localised channel blockage without deep GDE pore flooding — as corroborated by the stable cell voltage in Figure 2b (GDE hydrophobicity maintained by the PTFE binder throughout).</w:t>
+      </w:r>
+    </w:p>
+    <w:p>
+      <w:pPr>
+        <w:pStyle w:val="Normal"/>
+      </w:pPr>
+    </w:p>
+    <w:p>
+      <w:pPr>
+        <w:pStyle w:val="Normal"/>
+      </w:pPr>
+      <w:r>
+        <w:rPr>
+          <w:sz w:val="22"/>
+          <w:szCs w:val="22"/>
+        </w:rPr>
+        <w:t xml:space="preserve">Taken together, Figures 2b and 3 demonstrate that the cell voltage fingerprint and the cathode inlet pressure profile are complementary and mutually corroborating diagnostic signatures of the same failure cascade: in the serpentine configurations, progressive salt blockage (rising pressure) starves the GDE of CO₂, driving back-flooding of GDE pores and shifting the reaction to HER, with the resulting iR drop and thermodynamic shift producing a decreasing cell voltage; in the parallel configuration, water channel blockage (brief pressure spike) reduces active CO₂RR area without penetrating the GDE pore bulk, preserving ohmic resistance and producing a stable cell voltage despite the rapid FE(CO) collapse. These findings confirm the single-serpentine flow-field as the optimal cathode geometry for durability in the 100 cm² AEM system under the current operating conditions.</w:t>
+      </w:r>
+    </w:p>
+    <w:p>
+      <w:pPr>
+        <w:pStyle w:val="Normal"/>
+      </w:pPr>
+    </w:p>
+    <w:p>
+      <w:pPr>
+        <w:pStyle w:val="Normal"/>
+      </w:pPr>
+      <w:r>
+        <w:rPr>
+          <w:i/>
+          <w:sz w:val="22"/>
+          <w:szCs w:val="22"/>
+        </w:rPr>
+        <w:t xml:space="preserve">Figure 2b. FE(CO) and cell voltage of AgNPs (&gt;100 nm, 0.4–0.5 mg·cm⁻²) in a 100 cm² AEM (Sustanion) MEA electrolyzer with single-serpentine, quad-serpentine, and parallel cathode flow-field configurations under 50 mM CH₃COOH humidified CO₂ (200 ml·min⁻¹), 100 ml·min⁻¹ 0.1 M KHCO₃, and IrO₂-TiPt anode at 100 mA·cm⁻². Green shaded region indicates CO₂ flushing event (single-serpentine, ~47–50 h).</w:t>
+      </w:r>
+    </w:p>
+    <w:p>
+      <w:pPr>
+        <w:pStyle w:val="Normal"/>
+      </w:pPr>
+    </w:p>
+    <w:p>
+      <w:pPr>
+        <w:pStyle w:val="Normal"/>
+      </w:pPr>
+      <w:r>
+        <w:rPr>
+          <w:i/>
+          <w:sz w:val="22"/>
+          <w:szCs w:val="22"/>
+        </w:rPr>
+        <w:t xml:space="preserve">Figure 3. Cathodic CO₂ inlet pressure profiles for single-serpentine, quad-serpentine, and parallel flow-field configurations during CO₂ electrolysis of AgNPs (&gt;100 nm, 0.4–0.5 mg·cm⁻²) in 100 cm² AEM (Sustanion) MEA electrolyzer under 50 mM CH₃COOH humidified CO₂ (200 ml·min⁻¹), 100 ml·min⁻¹ 0.1 M KHCO₃, and IrO₂-TiPt anode at 100 mA·cm⁻². Photographs of each flow-field plate are shown above.</w:t>
+      </w:r>
+    </w:p>
+    <w:p>
+      <w:pPr>
+        <w:pStyle w:val="Normal"/>
+      </w:pPr>
+    </w:p>
+    <w:p>
+      <w:pPr>
+        <w:pStyle w:val="Normal"/>
+      </w:pPr>
+      <w:r>
+        <w:rPr>
+          <w:b/>
+          <w:sz w:val="22"/>
+          <w:szCs w:val="22"/>
+        </w:rPr>
+        <w:t xml:space="preserve">Influence of CO₂ flow rate on long-term stability of AgNPs in parallel flow-field MEA system at 100 cm²</w:t>
+      </w:r>
+    </w:p>
+    <w:p>
+      <w:pPr>
+        <w:pStyle w:val="Normal"/>
+      </w:pPr>
+      <w:r>
+        <w:rPr>
+          <w:sz w:val="22"/>
+          <w:szCs w:val="22"/>
+        </w:rPr>
+        <w:t xml:space="preserve">To evaluate the effect of CO₂ flow rate on long-term CO₂RR stability in the parallel flow-field configuration, CO₂ electrolysis of AgNPs (50 nm, ~0.6 mg·cm⁻²) was conducted in a 100 cm² AEM (Sustanion) MEA electrolyzer at cathodic CO₂ flow rates of 200 ml·min⁻¹ (2 ml·min⁻¹·cm⁻²) and 400 ml·min⁻¹ (4 ml·min⁻¹·cm⁻²) under 50 mM CH₃COOH humidification, 100 ml·min⁻¹ of 0.1 M KHCO₃, and an IrO₂-TiPt anode at 100 mA·cm⁻². As shown in Figure 5, both conditions achieved high initial FE(CO) of approximately 90–93%, with a brief peak of ~98% observed at approximately 3 h for both flow rates. At the higher CO₂ flow rate of 400 ml·min⁻¹, FE(CO) was sustained above 85% throughout the 24 h test, with a stable cell voltage of approximately 3.45 V. In contrast, at 200 ml·min⁻¹, FE(CO) declined more rapidly, dropping to approximately 50% at ~20 h before partially recovering to ~73% at ~24 h, while the cell voltage remained similarly stable at approximately 3.4 V throughout. Interestingly, the stable cell voltage observed under both flow-rate conditions is consistent with the parallel flow-field voltage fingerprint identified in Figure 2b — confirming that the failure mechanism remains channel-level water blockage without deep GDE pore flooding, irrespective of CO₂ flow rate. The significantly improved FE(CO) stability at 400 ml·min⁻¹ relative to 200 ml·min⁻¹ is consistent with the higher per-channel gas velocity more effectively displacing accumulated liquid water from the parallel channel outlets, thereby delaying blockage and maintaining CO₂ access to the GDE surface. According to our previous results, a similar temporary FE(CO) recovery was observed upon doubling CO₂ flow rate during the parallel flow-field run in Figure 2b, further supporting that increased flow velocity is the governing factor. These results indicate that increasing the CO₂ flow rate to 400 ml·min⁻¹ is an effective operational strategy to extend durability in the parallel flow-field configuration; however, given that the inherently low per-channel pressure drop remains the geometric constraint of the parallel design, further improvement will require either a flow-field geometry change or a higher CO₂ velocity per channel.</w:t>
+      </w:r>
+    </w:p>
+    <w:p>
+      <w:pPr>
+        <w:pStyle w:val="Normal"/>
+      </w:pPr>
+    </w:p>
+    <w:p>
+      <w:pPr>
+        <w:pStyle w:val="Normal"/>
+      </w:pPr>
+      <w:r>
+        <w:rPr>
+          <w:i/>
+          <w:sz w:val="22"/>
+          <w:szCs w:val="22"/>
+        </w:rPr>
+        <w:t xml:space="preserve">Figure 5. FE(CO) and cell voltage of AgNPs (50 nm, ~0.6 mg·cm⁻²) in a 100 cm² AEM (Sustanion) MEA electrolyzer with parallel flow-field at CO₂ flow rates of 200 and 400 ml·min⁻¹ under 50 mM CH₃COOH humidification, 100 ml·min⁻¹ 0.1 M KHCO₃, and IrO₂-TiPt anode at 100 mA·cm⁻².</w:t>
+      </w:r>
+    </w:p>
+    <w:p>
+      <w:pPr>
+        <w:pStyle w:val="Normal"/>
+      </w:pPr>
+    </w:p>
     <w:p>
       <w:pPr>
         <w:spacing w:line="360" w:lineRule="auto"/>

</xml_diff>